<commit_message>
Added Voice of the Silent and new role (Mouths)
</commit_message>
<xml_diff>
--- a/Scripture/ManifestoOfTheHighResonant.docx
+++ b/Scripture/ManifestoOfTheHighResonant.docx
@@ -52,15 +52,15 @@
               <w14:ligatures w14:val="standardContextual"/>
             </w:rPr>
             <w:drawing>
-              <wp:anchor distT="0" distB="0" distL="114300" distR="114300" simplePos="0" relativeHeight="251658240" behindDoc="0" locked="0" layoutInCell="1" allowOverlap="1" wp14:anchorId="5A59500C" wp14:editId="77DC2A26">
+              <wp:anchor distT="0" distB="0" distL="114300" distR="114300" simplePos="0" relativeHeight="251658240" behindDoc="0" locked="0" layoutInCell="1" allowOverlap="1" wp14:anchorId="5A59500C" wp14:editId="517D2936">
                 <wp:simplePos x="0" y="0"/>
                 <wp:positionH relativeFrom="column">
                   <wp:posOffset>-1320487</wp:posOffset>
                 </wp:positionH>
-                <wp:positionV relativeFrom="paragraph">
-                  <wp:posOffset>-977265</wp:posOffset>
+                <wp:positionV relativeFrom="page">
+                  <wp:posOffset>-62865</wp:posOffset>
                 </wp:positionV>
-                <wp:extent cx="7751105" cy="10789244"/>
+                <wp:extent cx="7750810" cy="10788650"/>
                 <wp:effectExtent l="0" t="0" r="2540" b="0"/>
                 <wp:wrapNone/>
                 <wp:docPr id="747920801" name="Picture 2"/>
@@ -92,7 +92,7 @@
                       <pic:spPr bwMode="auto">
                         <a:xfrm>
                           <a:off x="0" y="0"/>
-                          <a:ext cx="7751105" cy="10789244"/>
+                          <a:ext cx="7750810" cy="10788650"/>
                         </a:xfrm>
                         <a:prstGeom prst="rect">
                           <a:avLst/>
@@ -123,7 +123,9 @@
     <w:sdt>
       <w:sdtPr>
         <w:rPr>
-          <w:rFonts w:eastAsiaTheme="minorHAnsi" w:cstheme="minorBidi"/>
+          <w:rFonts w:ascii="Lugrasimo" w:eastAsiaTheme="minorHAnsi" w:hAnsi="Lugrasimo" w:cstheme="minorBidi"/>
+          <w:b w:val="0"/>
+          <w:bCs w:val="0"/>
           <w:color w:val="auto"/>
           <w:kern w:val="2"/>
           <w:sz w:val="24"/>
@@ -139,9 +141,6 @@
       </w:sdtPr>
       <w:sdtEndPr>
         <w:rPr>
-          <w:rFonts w:ascii="Lugrasimo" w:hAnsi="Lugrasimo"/>
-          <w:b w:val="0"/>
-          <w:bCs w:val="0"/>
           <w:noProof/>
           <w:color w:val="000000" w:themeColor="text1"/>
         </w:rPr>
@@ -189,7 +188,7 @@
           <w:r>
             <w:fldChar w:fldCharType="separate"/>
           </w:r>
-          <w:hyperlink w:anchor="_Toc223196261" w:history="1">
+          <w:hyperlink w:anchor="_Toc223306036" w:history="1">
             <w:r>
               <w:rPr>
                 <w:rStyle w:val="Hyperlink"/>
@@ -216,7 +215,7 @@
                 <w:noProof/>
                 <w:webHidden/>
               </w:rPr>
-              <w:instrText xml:space="preserve"> PAGEREF _Toc223196261 \h </w:instrText>
+              <w:instrText xml:space="preserve"> PAGEREF _Toc223306036 \h </w:instrText>
             </w:r>
             <w:r>
               <w:rPr>
@@ -272,7 +271,7 @@
               </w14:textOutline>
             </w:rPr>
           </w:pPr>
-          <w:hyperlink w:anchor="_Toc223196262" w:history="1">
+          <w:hyperlink w:anchor="_Toc223306037" w:history="1">
             <w:r>
               <w:rPr>
                 <w:rStyle w:val="Hyperlink"/>
@@ -299,7 +298,7 @@
                 <w:noProof/>
                 <w:webHidden/>
               </w:rPr>
-              <w:instrText xml:space="preserve"> PAGEREF _Toc223196262 \h </w:instrText>
+              <w:instrText xml:space="preserve"> PAGEREF _Toc223306037 \h </w:instrText>
             </w:r>
             <w:r>
               <w:rPr>
@@ -355,7 +354,7 @@
               </w14:textOutline>
             </w:rPr>
           </w:pPr>
-          <w:hyperlink w:anchor="_Toc223196263" w:history="1">
+          <w:hyperlink w:anchor="_Toc223306038" w:history="1">
             <w:r>
               <w:rPr>
                 <w:rStyle w:val="Hyperlink"/>
@@ -382,7 +381,7 @@
                 <w:noProof/>
                 <w:webHidden/>
               </w:rPr>
-              <w:instrText xml:space="preserve"> PAGEREF _Toc223196263 \h </w:instrText>
+              <w:instrText xml:space="preserve"> PAGEREF _Toc223306038 \h </w:instrText>
             </w:r>
             <w:r>
               <w:rPr>
@@ -438,7 +437,7 @@
               </w14:textOutline>
             </w:rPr>
           </w:pPr>
-          <w:hyperlink w:anchor="_Toc223196264" w:history="1">
+          <w:hyperlink w:anchor="_Toc223306039" w:history="1">
             <w:r>
               <w:rPr>
                 <w:rStyle w:val="Hyperlink"/>
@@ -465,7 +464,7 @@
                 <w:noProof/>
                 <w:webHidden/>
               </w:rPr>
-              <w:instrText xml:space="preserve"> PAGEREF _Toc223196264 \h </w:instrText>
+              <w:instrText xml:space="preserve"> PAGEREF _Toc223306039 \h </w:instrText>
             </w:r>
             <w:r>
               <w:rPr>
@@ -521,7 +520,7 @@
               </w14:textOutline>
             </w:rPr>
           </w:pPr>
-          <w:hyperlink w:anchor="_Toc223196265" w:history="1">
+          <w:hyperlink w:anchor="_Toc223306040" w:history="1">
             <w:r>
               <w:rPr>
                 <w:rStyle w:val="Hyperlink"/>
@@ -548,7 +547,7 @@
                 <w:noProof/>
                 <w:webHidden/>
               </w:rPr>
-              <w:instrText xml:space="preserve"> PAGEREF _Toc223196265 \h </w:instrText>
+              <w:instrText xml:space="preserve"> PAGEREF _Toc223306040 \h </w:instrText>
             </w:r>
             <w:r>
               <w:rPr>
@@ -604,7 +603,7 @@
               </w14:textOutline>
             </w:rPr>
           </w:pPr>
-          <w:hyperlink w:anchor="_Toc223196266" w:history="1">
+          <w:hyperlink w:anchor="_Toc223306041" w:history="1">
             <w:r>
               <w:rPr>
                 <w:rStyle w:val="Hyperlink"/>
@@ -631,7 +630,7 @@
                 <w:noProof/>
                 <w:webHidden/>
               </w:rPr>
-              <w:instrText xml:space="preserve"> PAGEREF _Toc223196266 \h </w:instrText>
+              <w:instrText xml:space="preserve"> PAGEREF _Toc223306041 \h </w:instrText>
             </w:r>
             <w:r>
               <w:rPr>
@@ -687,7 +686,7 @@
               </w14:textOutline>
             </w:rPr>
           </w:pPr>
-          <w:hyperlink w:anchor="_Toc223196267" w:history="1">
+          <w:hyperlink w:anchor="_Toc223306042" w:history="1">
             <w:r>
               <w:rPr>
                 <w:rStyle w:val="Hyperlink"/>
@@ -714,7 +713,7 @@
                 <w:noProof/>
                 <w:webHidden/>
               </w:rPr>
-              <w:instrText xml:space="preserve"> PAGEREF _Toc223196267 \h </w:instrText>
+              <w:instrText xml:space="preserve"> PAGEREF _Toc223306042 \h </w:instrText>
             </w:r>
             <w:r>
               <w:rPr>
@@ -770,7 +769,7 @@
               </w14:textOutline>
             </w:rPr>
           </w:pPr>
-          <w:hyperlink w:anchor="_Toc223196268" w:history="1">
+          <w:hyperlink w:anchor="_Toc223306043" w:history="1">
             <w:r>
               <w:rPr>
                 <w:rStyle w:val="Hyperlink"/>
@@ -797,7 +796,7 @@
                 <w:noProof/>
                 <w:webHidden/>
               </w:rPr>
-              <w:instrText xml:space="preserve"> PAGEREF _Toc223196268 \h </w:instrText>
+              <w:instrText xml:space="preserve"> PAGEREF _Toc223306043 \h </w:instrText>
             </w:r>
             <w:r>
               <w:rPr>
@@ -851,7 +850,7 @@
               </w14:textOutline>
             </w:rPr>
           </w:pPr>
-          <w:hyperlink w:anchor="_Toc223196269" w:history="1">
+          <w:hyperlink w:anchor="_Toc223306044" w:history="1">
             <w:r>
               <w:rPr>
                 <w:rStyle w:val="Hyperlink"/>
@@ -878,7 +877,7 @@
                 <w:noProof/>
                 <w:webHidden/>
               </w:rPr>
-              <w:instrText xml:space="preserve"> PAGEREF _Toc223196269 \h </w:instrText>
+              <w:instrText xml:space="preserve"> PAGEREF _Toc223306044 \h </w:instrText>
             </w:r>
             <w:r>
               <w:rPr>
@@ -932,7 +931,7 @@
               </w14:textOutline>
             </w:rPr>
           </w:pPr>
-          <w:hyperlink w:anchor="_Toc223196270" w:history="1">
+          <w:hyperlink w:anchor="_Toc223306045" w:history="1">
             <w:r>
               <w:rPr>
                 <w:rStyle w:val="Hyperlink"/>
@@ -959,7 +958,7 @@
                 <w:noProof/>
                 <w:webHidden/>
               </w:rPr>
-              <w:instrText xml:space="preserve"> PAGEREF _Toc223196270 \h </w:instrText>
+              <w:instrText xml:space="preserve"> PAGEREF _Toc223306045 \h </w:instrText>
             </w:r>
             <w:r>
               <w:rPr>
@@ -979,7 +978,7 @@
                 <w:noProof/>
                 <w:webHidden/>
               </w:rPr>
-              <w:t>3</w:t>
+              <w:t>4</w:t>
             </w:r>
             <w:r>
               <w:rPr>
@@ -1015,12 +1014,95 @@
               </w14:textOutline>
             </w:rPr>
           </w:pPr>
-          <w:hyperlink w:anchor="_Toc223196271" w:history="1">
+          <w:hyperlink w:anchor="_Toc223306046" w:history="1">
             <w:r>
               <w:rPr>
                 <w:rStyle w:val="Hyperlink"/>
                 <w:noProof/>
               </w:rPr>
+              <w:t>The Mouths</w:t>
+            </w:r>
+            <w:r>
+              <w:rPr>
+                <w:noProof/>
+                <w:webHidden/>
+              </w:rPr>
+              <w:tab/>
+            </w:r>
+            <w:r>
+              <w:rPr>
+                <w:noProof/>
+                <w:webHidden/>
+              </w:rPr>
+              <w:fldChar w:fldCharType="begin"/>
+            </w:r>
+            <w:r>
+              <w:rPr>
+                <w:noProof/>
+                <w:webHidden/>
+              </w:rPr>
+              <w:instrText xml:space="preserve"> PAGEREF _Toc223306046 \h </w:instrText>
+            </w:r>
+            <w:r>
+              <w:rPr>
+                <w:noProof/>
+                <w:webHidden/>
+              </w:rPr>
+            </w:r>
+            <w:r>
+              <w:rPr>
+                <w:noProof/>
+                <w:webHidden/>
+              </w:rPr>
+              <w:fldChar w:fldCharType="separate"/>
+            </w:r>
+            <w:r>
+              <w:rPr>
+                <w:noProof/>
+                <w:webHidden/>
+              </w:rPr>
+              <w:t>6</w:t>
+            </w:r>
+            <w:r>
+              <w:rPr>
+                <w:noProof/>
+                <w:webHidden/>
+              </w:rPr>
+              <w:fldChar w:fldCharType="end"/>
+            </w:r>
+          </w:hyperlink>
+        </w:p>
+        <w:p>
+          <w:pPr>
+            <w:pStyle w:val="TOC2"/>
+            <w:tabs>
+              <w:tab w:val="right" w:leader="dot" w:pos="8296"/>
+            </w:tabs>
+            <w:rPr>
+              <w:rFonts w:eastAsiaTheme="minorEastAsia"/>
+              <w:b w:val="0"/>
+              <w:bCs w:val="0"/>
+              <w:noProof/>
+              <w:color w:val="auto"/>
+              <w:sz w:val="24"/>
+              <w:szCs w:val="24"/>
+              <w:lang w:val="en-IE" w:eastAsia="en-IE"/>
+              <w14:shadow w14:blurRad="0" w14:dist="0" w14:dir="0" w14:sx="0" w14:sy="0" w14:kx="0" w14:ky="0" w14:algn="none">
+                <w14:srgbClr w14:val="000000"/>
+              </w14:shadow>
+              <w14:textOutline w14:w="0" w14:cap="rnd" w14:cmpd="sng" w14:algn="ctr">
+                <w14:noFill/>
+                <w14:prstDash w14:val="solid"/>
+                <w14:bevel/>
+              </w14:textOutline>
+            </w:rPr>
+          </w:pPr>
+          <w:hyperlink w:anchor="_Toc223306047" w:history="1">
+            <w:r>
+              <w:rPr>
+                <w:rStyle w:val="Hyperlink"/>
+                <w:noProof/>
+              </w:rPr>
               <w:t>The Whispers</w:t>
             </w:r>
             <w:r>
@@ -1042,7 +1124,7 @@
                 <w:noProof/>
                 <w:webHidden/>
               </w:rPr>
-              <w:instrText xml:space="preserve"> PAGEREF _Toc223196271 \h </w:instrText>
+              <w:instrText xml:space="preserve"> PAGEREF _Toc223306047 \h </w:instrText>
             </w:r>
             <w:r>
               <w:rPr>
@@ -1062,7 +1144,7 @@
                 <w:noProof/>
                 <w:webHidden/>
               </w:rPr>
-              <w:t>3</w:t>
+              <w:t>6</w:t>
             </w:r>
             <w:r>
               <w:rPr>
@@ -1098,7 +1180,7 @@
               </w14:textOutline>
             </w:rPr>
           </w:pPr>
-          <w:hyperlink w:anchor="_Toc223196272" w:history="1">
+          <w:hyperlink w:anchor="_Toc223306048" w:history="1">
             <w:r>
               <w:rPr>
                 <w:rStyle w:val="Hyperlink"/>
@@ -1125,7 +1207,7 @@
                 <w:noProof/>
                 <w:webHidden/>
               </w:rPr>
-              <w:instrText xml:space="preserve"> PAGEREF _Toc223196272 \h </w:instrText>
+              <w:instrText xml:space="preserve"> PAGEREF _Toc223306048 \h </w:instrText>
             </w:r>
             <w:r>
               <w:rPr>
@@ -1145,7 +1227,7 @@
                 <w:noProof/>
                 <w:webHidden/>
               </w:rPr>
-              <w:t>4</w:t>
+              <w:t>7</w:t>
             </w:r>
             <w:r>
               <w:rPr>
@@ -1181,7 +1263,7 @@
               </w14:textOutline>
             </w:rPr>
           </w:pPr>
-          <w:hyperlink w:anchor="_Toc223196273" w:history="1">
+          <w:hyperlink w:anchor="_Toc223306049" w:history="1">
             <w:r>
               <w:rPr>
                 <w:rStyle w:val="Hyperlink"/>
@@ -1208,7 +1290,7 @@
                 <w:noProof/>
                 <w:webHidden/>
               </w:rPr>
-              <w:instrText xml:space="preserve"> PAGEREF _Toc223196273 \h </w:instrText>
+              <w:instrText xml:space="preserve"> PAGEREF _Toc223306049 \h </w:instrText>
             </w:r>
             <w:r>
               <w:rPr>
@@ -1228,7 +1310,7 @@
                 <w:noProof/>
                 <w:webHidden/>
               </w:rPr>
-              <w:t>4</w:t>
+              <w:t>7</w:t>
             </w:r>
             <w:r>
               <w:rPr>
@@ -1264,7 +1346,7 @@
               </w14:textOutline>
             </w:rPr>
           </w:pPr>
-          <w:hyperlink w:anchor="_Toc223196274" w:history="1">
+          <w:hyperlink w:anchor="_Toc223306050" w:history="1">
             <w:r>
               <w:rPr>
                 <w:rStyle w:val="Hyperlink"/>
@@ -1291,7 +1373,7 @@
                 <w:noProof/>
                 <w:webHidden/>
               </w:rPr>
-              <w:instrText xml:space="preserve"> PAGEREF _Toc223196274 \h </w:instrText>
+              <w:instrText xml:space="preserve"> PAGEREF _Toc223306050 \h </w:instrText>
             </w:r>
             <w:r>
               <w:rPr>
@@ -1311,7 +1393,7 @@
                 <w:noProof/>
                 <w:webHidden/>
               </w:rPr>
-              <w:t>4</w:t>
+              <w:t>7</w:t>
             </w:r>
             <w:r>
               <w:rPr>
@@ -1347,7 +1429,7 @@
               </w14:textOutline>
             </w:rPr>
           </w:pPr>
-          <w:hyperlink w:anchor="_Toc223196275" w:history="1">
+          <w:hyperlink w:anchor="_Toc223306051" w:history="1">
             <w:r>
               <w:rPr>
                 <w:rStyle w:val="Hyperlink"/>
@@ -1374,7 +1456,7 @@
                 <w:noProof/>
                 <w:webHidden/>
               </w:rPr>
-              <w:instrText xml:space="preserve"> PAGEREF _Toc223196275 \h </w:instrText>
+              <w:instrText xml:space="preserve"> PAGEREF _Toc223306051 \h </w:instrText>
             </w:r>
             <w:r>
               <w:rPr>
@@ -1394,7 +1476,7 @@
                 <w:noProof/>
                 <w:webHidden/>
               </w:rPr>
-              <w:t>5</w:t>
+              <w:t>8</w:t>
             </w:r>
             <w:r>
               <w:rPr>
@@ -1430,7 +1512,7 @@
               </w14:textOutline>
             </w:rPr>
           </w:pPr>
-          <w:hyperlink w:anchor="_Toc223196276" w:history="1">
+          <w:hyperlink w:anchor="_Toc223306052" w:history="1">
             <w:r>
               <w:rPr>
                 <w:rStyle w:val="Hyperlink"/>
@@ -1457,7 +1539,7 @@
                 <w:noProof/>
                 <w:webHidden/>
               </w:rPr>
-              <w:instrText xml:space="preserve"> PAGEREF _Toc223196276 \h </w:instrText>
+              <w:instrText xml:space="preserve"> PAGEREF _Toc223306052 \h </w:instrText>
             </w:r>
             <w:r>
               <w:rPr>
@@ -1477,7 +1559,7 @@
                 <w:noProof/>
                 <w:webHidden/>
               </w:rPr>
-              <w:t>6</w:t>
+              <w:t>9</w:t>
             </w:r>
             <w:r>
               <w:rPr>
@@ -1513,7 +1595,7 @@
               </w14:textOutline>
             </w:rPr>
           </w:pPr>
-          <w:hyperlink w:anchor="_Toc223196277" w:history="1">
+          <w:hyperlink w:anchor="_Toc223306053" w:history="1">
             <w:r>
               <w:rPr>
                 <w:rStyle w:val="Hyperlink"/>
@@ -1540,7 +1622,7 @@
                 <w:noProof/>
                 <w:webHidden/>
               </w:rPr>
-              <w:instrText xml:space="preserve"> PAGEREF _Toc223196277 \h </w:instrText>
+              <w:instrText xml:space="preserve"> PAGEREF _Toc223306053 \h </w:instrText>
             </w:r>
             <w:r>
               <w:rPr>
@@ -1560,7 +1642,7 @@
                 <w:noProof/>
                 <w:webHidden/>
               </w:rPr>
-              <w:t>7</w:t>
+              <w:t>10</w:t>
             </w:r>
             <w:r>
               <w:rPr>
@@ -1596,7 +1678,7 @@
               </w14:textOutline>
             </w:rPr>
           </w:pPr>
-          <w:hyperlink w:anchor="_Toc223196278" w:history="1">
+          <w:hyperlink w:anchor="_Toc223306054" w:history="1">
             <w:r>
               <w:rPr>
                 <w:rStyle w:val="Hyperlink"/>
@@ -1623,7 +1705,7 @@
                 <w:noProof/>
                 <w:webHidden/>
               </w:rPr>
-              <w:instrText xml:space="preserve"> PAGEREF _Toc223196278 \h </w:instrText>
+              <w:instrText xml:space="preserve"> PAGEREF _Toc223306054 \h </w:instrText>
             </w:r>
             <w:r>
               <w:rPr>
@@ -1643,7 +1725,7 @@
                 <w:noProof/>
                 <w:webHidden/>
               </w:rPr>
-              <w:t>7</w:t>
+              <w:t>10</w:t>
             </w:r>
             <w:r>
               <w:rPr>
@@ -1679,7 +1761,7 @@
               </w14:textOutline>
             </w:rPr>
           </w:pPr>
-          <w:hyperlink w:anchor="_Toc223196279" w:history="1">
+          <w:hyperlink w:anchor="_Toc223306055" w:history="1">
             <w:r>
               <w:rPr>
                 <w:rStyle w:val="Hyperlink"/>
@@ -1706,7 +1788,7 @@
                 <w:noProof/>
                 <w:webHidden/>
               </w:rPr>
-              <w:instrText xml:space="preserve"> PAGEREF _Toc223196279 \h </w:instrText>
+              <w:instrText xml:space="preserve"> PAGEREF _Toc223306055 \h </w:instrText>
             </w:r>
             <w:r>
               <w:rPr>
@@ -1726,7 +1808,7 @@
                 <w:noProof/>
                 <w:webHidden/>
               </w:rPr>
-              <w:t>7</w:t>
+              <w:t>10</w:t>
             </w:r>
             <w:r>
               <w:rPr>
@@ -1758,7 +1840,7 @@
       <w:pPr>
         <w:pStyle w:val="Heading1"/>
       </w:pPr>
-      <w:bookmarkStart w:id="0" w:name="_Toc223196261"/>
+      <w:bookmarkStart w:id="0" w:name="_Toc223306036"/>
       <w:r>
         <w:lastRenderedPageBreak/>
         <w:t>Prologue</w:t>
@@ -1799,7 +1881,7 @@
       <w:pPr>
         <w:pStyle w:val="Heading1"/>
       </w:pPr>
-      <w:bookmarkStart w:id="1" w:name="_Toc223196262"/>
+      <w:bookmarkStart w:id="1" w:name="_Toc223306037"/>
       <w:r>
         <w:t>History</w:t>
       </w:r>
@@ -1809,7 +1891,7 @@
       <w:pPr>
         <w:pStyle w:val="Heading2"/>
       </w:pPr>
-      <w:bookmarkStart w:id="2" w:name="_Toc223196263"/>
+      <w:bookmarkStart w:id="2" w:name="_Toc223306038"/>
       <w:r>
         <w:t>The Old World</w:t>
       </w:r>
@@ -1819,7 +1901,7 @@
       <w:pPr>
         <w:pStyle w:val="Heading2"/>
       </w:pPr>
-      <w:bookmarkStart w:id="3" w:name="_Toc223196264"/>
+      <w:bookmarkStart w:id="3" w:name="_Toc223306039"/>
       <w:r>
         <w:t>The Great Hush</w:t>
       </w:r>
@@ -1829,7 +1911,7 @@
       <w:pPr>
         <w:pStyle w:val="Heading2"/>
       </w:pPr>
-      <w:bookmarkStart w:id="4" w:name="_Toc223196265"/>
+      <w:bookmarkStart w:id="4" w:name="_Toc223306040"/>
       <w:r>
         <w:t xml:space="preserve">The </w:t>
       </w:r>
@@ -1885,7 +1967,7 @@
       <w:pPr>
         <w:pStyle w:val="Heading2"/>
       </w:pPr>
-      <w:bookmarkStart w:id="5" w:name="_Toc223196266"/>
+      <w:bookmarkStart w:id="5" w:name="_Toc223306041"/>
       <w:r>
         <w:lastRenderedPageBreak/>
         <w:t>The High Resonant</w:t>
@@ -1896,7 +1978,7 @@
       <w:pPr>
         <w:pStyle w:val="Heading2"/>
       </w:pPr>
-      <w:bookmarkStart w:id="6" w:name="_Toc223196267"/>
+      <w:bookmarkStart w:id="6" w:name="_Toc223306042"/>
       <w:r>
         <w:t>The Word of the Quiet</w:t>
       </w:r>
@@ -1906,7 +1988,7 @@
       <w:pPr>
         <w:pStyle w:val="Heading2"/>
       </w:pPr>
-      <w:bookmarkStart w:id="7" w:name="_Toc223196268"/>
+      <w:bookmarkStart w:id="7" w:name="_Toc223306043"/>
       <w:r>
         <w:t>The Voices</w:t>
       </w:r>
@@ -1958,15 +2040,34 @@
       <w:pPr>
         <w:pStyle w:val="Heading3"/>
       </w:pPr>
-      <w:bookmarkStart w:id="8" w:name="_Toc223196269"/>
+      <w:bookmarkStart w:id="8" w:name="_Toc223306044"/>
       <w:r>
         <w:t>Voice of the Scroll</w:t>
       </w:r>
       <w:bookmarkEnd w:id="8"/>
     </w:p>
     <w:p>
-      <w:r>
-        <w:t>A man by the name of Alistair Pembroke once found the High Resonant alone at the altar of a Church. Alistair was a raider, loud and smelling of gasoline. He put a rifle to the Father’s head and screamed for his boots and his life.</w:t>
+      <w:pPr>
+        <w:keepNext/>
+        <w:framePr w:dropCap="drop" w:lines="3" w:hSpace="170" w:wrap="around" w:vAnchor="text" w:hAnchor="text"/>
+        <w:spacing w:after="0" w:line="1254" w:lineRule="exact"/>
+        <w:textAlignment w:val="baseline"/>
+        <w:rPr>
+          <w:position w:val="-8"/>
+          <w:sz w:val="127"/>
+        </w:rPr>
+      </w:pPr>
+      <w:r>
+        <w:rPr>
+          <w:position w:val="-8"/>
+          <w:sz w:val="127"/>
+        </w:rPr>
+        <w:t>A</w:t>
+      </w:r>
+    </w:p>
+    <w:p>
+      <w:r>
+        <w:t>man by the name of Alistair Pembroke once found the High Resonant alone at the altar of a Church. Alistair was a raider, loud and smelling of gasoline. He put a rifle to the Father’s head and screamed for his boots and his life.</w:t>
       </w:r>
     </w:p>
     <w:p>
@@ -1976,7 +2077,11 @@
     </w:p>
     <w:p>
       <w:r>
-        <w:t>The Father finally looked at him and said, 'Even the brass knows the song, friend. It refuses to make a noise that would ruin the Silence.' Alistair dropped the gun and started weeping. He is a Voice now.</w:t>
+        <w:t xml:space="preserve">The Father finally looked at him and said, 'Even the brass knows the song, friend. It refuses to make a noise that would ruin the </w:t>
+      </w:r>
+      <w:r>
+        <w:lastRenderedPageBreak/>
+        <w:t>Silence.' Alistair dropped the gun and started weeping. He is a Voice now.</w:t>
       </w:r>
     </w:p>
     <w:p/>
@@ -1987,13 +2092,7 @@
     </w:p>
     <w:p>
       <w:r>
-        <w:t>The Voice of the Scroll speaks as though addressing a class; measured and articulate. He thanks those who listen. He tries to help tho</w:t>
-      </w:r>
-      <w:r>
-        <w:t>s</w:t>
-      </w:r>
-      <w:r>
-        <w:t>e who do not with gentle insistence.</w:t>
+        <w:t>The Voice of the Scroll speaks as though addressing a class; measured and articulate. He thanks those who listen. He tries to help those who do not with gentle insistence.</w:t>
       </w:r>
     </w:p>
     <w:p>
@@ -2021,21 +2120,126 @@
       <w:pPr>
         <w:pStyle w:val="Heading3"/>
       </w:pPr>
-      <w:bookmarkStart w:id="9" w:name="_Toc223196270"/>
+      <w:bookmarkStart w:id="9" w:name="_Toc223306045"/>
       <w:r>
         <w:t>Voice of the Silent</w:t>
       </w:r>
       <w:bookmarkEnd w:id="9"/>
     </w:p>
+    <w:p>
+      <w:pPr>
+        <w:keepNext/>
+        <w:framePr w:dropCap="drop" w:lines="3" w:hSpace="170" w:wrap="around" w:vAnchor="text" w:hAnchor="text"/>
+        <w:spacing w:after="0" w:line="1254" w:lineRule="exact"/>
+        <w:textAlignment w:val="baseline"/>
+        <w:rPr>
+          <w:position w:val="-9"/>
+          <w:sz w:val="129"/>
+        </w:rPr>
+      </w:pPr>
+      <w:r>
+        <w:rPr>
+          <w:position w:val="-9"/>
+          <w:sz w:val="129"/>
+        </w:rPr>
+        <w:t>T</w:t>
+      </w:r>
+    </w:p>
+    <w:p>
+      <w:r>
+        <w:t xml:space="preserve">here was once a physician by the name of Ezekiel Saint-Claire. In the final days of the Old World, Ezekiel refused to let death win without first listening. While the hospitals collapsed beneath screams and bullets, and the Quiet began to rise, he would press his ear to the cooling chests of the dead. And waited. He whispered questions, seeking answers </w:t>
+      </w:r>
+      <w:r>
+        <w:lastRenderedPageBreak/>
+        <w:t xml:space="preserve">to the bloodshed and chaos that came with the fall of this Old World. </w:t>
+      </w:r>
+    </w:p>
+    <w:p>
+      <w:r>
+        <w:t xml:space="preserve">At first, nothing. But then, he began to hear faint whispers. Whispers that no living ear could catch. Soft, low vibrations that shaped themselves into words inside his fracturing mind. </w:t>
+      </w:r>
+    </w:p>
+    <w:p>
+      <w:r>
+        <w:t xml:space="preserve">When the Quiet breached the walls of the hospital, he did not fight nor flee; he walked among them, unscathed and uninterrupted. The Quiet would, on occasion, pause and tilt their heads in recognition. As if greeting an old colleague. </w:t>
+      </w:r>
+    </w:p>
+    <w:p>
+      <w:r>
+        <w:t>That same night, raiders stormed the ruins of the hospital with thunderous laughter and cracking rifles, only to find their weapons clicking empty on full magazines. The doctor rose to them and spoke in the borrowed voice of the undead: "Even the brass knows the song. It refuses to ruin the Great Silence."</w:t>
+      </w:r>
+    </w:p>
+    <w:p>
+      <w:r>
+        <w:t>Some time later, Father Vertis found him one dawn amid a swarm of swaying Quiet. He felt the same deep hum beneath the physician's skin and spoke to him. Henceforth, Ezekiel was named the Voice of the Silent. The tongue of every stilled and silent throat.</w:t>
+      </w:r>
+    </w:p>
+    <w:p>
+      <w:r>
+        <w:t>Today, he walks at the High Resonant's right hand through the ruins of the land, greeting each swaying corpse by name only he can hear, translating their wordless wisdom for the Great Hush. Raiders who cling to noise find their defiance folded into the perfect quiet. The faithful who ask how he speaks to the dead without losing himself receive only a finger to the lips and an answer in voices not his own.</w:t>
+      </w:r>
+    </w:p>
+    <w:p>
+      <w:r>
+        <w:t>Is it still?</w:t>
+      </w:r>
+    </w:p>
+    <w:p/>
     <w:p>
       <w:pPr>
         <w:pStyle w:val="Heading2"/>
       </w:pPr>
-      <w:bookmarkStart w:id="10" w:name="_Toc223196271"/>
+      <w:bookmarkStart w:id="10" w:name="_Toc223306046"/>
+      <w:r>
+        <w:lastRenderedPageBreak/>
+        <w:t>The Mouths</w:t>
+      </w:r>
+      <w:bookmarkEnd w:id="10"/>
+    </w:p>
+    <w:p>
+      <w:pPr>
+        <w:keepNext/>
+        <w:framePr w:dropCap="drop" w:lines="4" w:h="1572" w:hRule="exact" w:hSpace="170" w:wrap="around" w:vAnchor="text" w:hAnchor="text"/>
+        <w:spacing w:after="0" w:line="1572" w:lineRule="exact"/>
+        <w:textAlignment w:val="baseline"/>
+        <w:rPr>
+          <w:position w:val="-16"/>
+          <w:sz w:val="167"/>
+        </w:rPr>
+      </w:pPr>
+      <w:r>
+        <w:rPr>
+          <w:position w:val="-16"/>
+          <w:sz w:val="167"/>
+        </w:rPr>
+        <w:t>M</w:t>
+      </w:r>
+    </w:p>
+    <w:p>
+      <w:r>
+        <w:t xml:space="preserve">ouths are those who carry out the Word beyond the shelter of the Great Hush. They do not shape doctrine, nor do they tune the Static. They speak what has already been spoken. They carry the words of the High Resonant and the Voices in the aim of guiding others to the Great Hush for attunement; by any means necessary. </w:t>
+      </w:r>
+    </w:p>
+    <w:p>
+      <w:r>
+        <w:t>The Mouths are not just recruiters. They are the steady current beneath the noise of the world. For the mouth is not the source of the word, but the passage through which is travels.</w:t>
+      </w:r>
+    </w:p>
+    <w:p>
+      <w:r>
+        <w:t>Is it still?</w:t>
+      </w:r>
+    </w:p>
+    <w:p/>
+    <w:p>
+      <w:pPr>
+        <w:pStyle w:val="Heading2"/>
+      </w:pPr>
+      <w:bookmarkStart w:id="11" w:name="_Toc223306047"/>
       <w:r>
         <w:t>The Whispers</w:t>
       </w:r>
-      <w:bookmarkEnd w:id="10"/>
+      <w:bookmarkEnd w:id="11"/>
     </w:p>
     <w:p>
       <w:pPr>
@@ -2065,35 +2269,32 @@
         <w:t>he Whispers are the many, and they are content to be so. Where the Voices carry the music of the High Resonant outward, the Whispers carry it inward, holding it within them. They do not seek recognition, for recognition is a loud hunger. They do not seek command, for command is a sharp frequency. They are the soft murmur beneath a choir, the breath between words</w:t>
       </w:r>
       <w:r>
-        <w:t xml:space="preserve">, a presence that does </w:t>
-      </w:r>
-      <w:r>
-        <w:lastRenderedPageBreak/>
-        <w:t>not dare disturb the air. They follow the Word of the Quiet, for they may too be purified and attuned to the Resonance.</w:t>
+        <w:t>, a presence that does not dare disturb the air. They follow the Word of the Quiet, for they may too be purified and attuned to the Resonance.</w:t>
       </w:r>
     </w:p>
     <w:p>
       <w:pPr>
         <w:pStyle w:val="Heading1"/>
       </w:pPr>
-      <w:bookmarkStart w:id="11" w:name="_Toc223196272"/>
-      <w:r>
+      <w:bookmarkStart w:id="12" w:name="_Toc223306048"/>
+      <w:r>
+        <w:lastRenderedPageBreak/>
         <w:t>Echoes</w:t>
       </w:r>
       <w:r>
         <w:t xml:space="preserve"> of the Word of the Quiet</w:t>
       </w:r>
-      <w:bookmarkEnd w:id="11"/>
+      <w:bookmarkEnd w:id="12"/>
     </w:p>
     <w:p>
       <w:pPr>
         <w:pStyle w:val="Heading2"/>
       </w:pPr>
-      <w:bookmarkStart w:id="12" w:name="_Toc223196273"/>
+      <w:bookmarkStart w:id="13" w:name="_Toc223306049"/>
       <w:r>
         <w:t>Echo of the Resonance</w:t>
       </w:r>
-      <w:bookmarkEnd w:id="12"/>
+      <w:bookmarkEnd w:id="13"/>
     </w:p>
     <w:p>
       <w:pPr>
@@ -2169,11 +2370,11 @@
       <w:pPr>
         <w:pStyle w:val="Heading2"/>
       </w:pPr>
-      <w:bookmarkStart w:id="13" w:name="_Toc223196274"/>
+      <w:bookmarkStart w:id="14" w:name="_Toc223306050"/>
       <w:r>
         <w:t>Echo of the Silent Execution</w:t>
       </w:r>
-      <w:bookmarkEnd w:id="13"/>
+      <w:bookmarkEnd w:id="14"/>
     </w:p>
     <w:p>
       <w:pPr>
@@ -2196,15 +2397,12 @@
     </w:p>
     <w:p>
       <w:r>
-        <w:t xml:space="preserve">n the early days of the Great Hush, there was a man who roamed the lands. He was strong and fearless, but he carried his rifle as though the world still listened to </w:t>
-      </w:r>
+        <w:t xml:space="preserve">n the early days of the Great Hush, there was a man who roamed the lands. He was strong and fearless, but he carried his rifle as though the world still listened to thunder. He laughed too loudly. He fired too freely. He said the Quiet were but beasts to be hunted and nothing more. </w:t>
+      </w:r>
+    </w:p>
+    <w:p>
       <w:r>
         <w:lastRenderedPageBreak/>
-        <w:t xml:space="preserve">thunder. He laughed too loudly. He fired too freely. He said the Quiet were but beasts to be hunted and nothing more. </w:t>
-      </w:r>
-    </w:p>
-    <w:p>
-      <w:r>
         <w:t xml:space="preserve">The man was warned often. He was told that defiance was a static to be silenced. The man answered these warnings with gunfire. </w:t>
       </w:r>
     </w:p>
@@ -2223,11 +2421,11 @@
       <w:pPr>
         <w:pStyle w:val="Heading2"/>
       </w:pPr>
-      <w:bookmarkStart w:id="14" w:name="_Toc223196275"/>
+      <w:bookmarkStart w:id="15" w:name="_Toc223306051"/>
       <w:r>
         <w:t>Echo of the Violin</w:t>
       </w:r>
-      <w:bookmarkEnd w:id="14"/>
+      <w:bookmarkEnd w:id="15"/>
     </w:p>
     <w:p>
       <w:pPr>
@@ -2270,11 +2468,11 @@
     </w:p>
     <w:p>
       <w:r>
-        <w:t xml:space="preserve">The first note was soft. Clear and beautiful. The second carried further down the long street. By the third note, the streets had </w:t>
+        <w:t xml:space="preserve">The first note was soft. Clear and beautiful. The second carried further down the long street. By the third note, the streets had changed. The Quiet began to turn their heads. Not in anger, but in attention. One by one, they drifted closer. Not running. Not </w:t>
       </w:r>
       <w:r>
         <w:lastRenderedPageBreak/>
-        <w:t>changed. The Quiet began to turn their heads. Not in anger, but in attention. One by one, they drifted closer. Not running. Not snarling. Simply gathering, as though drawn by something familiar yet misplaced.</w:t>
+        <w:t>snarling. Simply gathering, as though drawn by something familiar yet misplaced.</w:t>
       </w:r>
     </w:p>
     <w:p>
@@ -2312,11 +2510,11 @@
       <w:pPr>
         <w:pStyle w:val="Heading2"/>
       </w:pPr>
-      <w:bookmarkStart w:id="15" w:name="_Toc223196276"/>
+      <w:bookmarkStart w:id="16" w:name="_Toc223306052"/>
       <w:r>
         <w:t>Echo of the Quiet Sea</w:t>
       </w:r>
-      <w:bookmarkEnd w:id="15"/>
+      <w:bookmarkEnd w:id="16"/>
     </w:p>
     <w:p>
       <w:pPr>
@@ -2344,18 +2542,15 @@
     </w:p>
     <w:p>
       <w:r>
-        <w:t xml:space="preserve">The Quiet circled him. Heads tilting, jaws slack with a low, endless groan. A groan of slow, raspy cadence. He did not fight the noise but aligned himself with it. Slowly, but surely, one </w:t>
-      </w:r>
+        <w:t>The Quiet circled him. Heads tilting, jaws slack with a low, endless groan. A groan of slow, raspy cadence. He did not fight the noise but aligned himself with it. Slowly, but surely, one turned away. Then another. Then another.</w:t>
+      </w:r>
+      <w:r>
+        <w:t xml:space="preserve"> The horde of Quiet parted, as a river bending around an unmoving stone.</w:t>
+      </w:r>
+    </w:p>
+    <w:p>
       <w:r>
         <w:lastRenderedPageBreak/>
-        <w:t>turned away. Then another. Then another.</w:t>
-      </w:r>
-      <w:r>
-        <w:t xml:space="preserve"> The horde of Quiet parted, as a river bending around an unmoving stone.</w:t>
-      </w:r>
-    </w:p>
-    <w:p>
-      <w:r>
         <w:t xml:space="preserve">To Father Vertis, this was no miracle. It was confirmation that he had attuned to the True Note. </w:t>
       </w:r>
     </w:p>
@@ -2373,31 +2568,31 @@
       <w:pPr>
         <w:pStyle w:val="Heading1"/>
       </w:pPr>
-      <w:bookmarkStart w:id="16" w:name="_Toc223196277"/>
+      <w:bookmarkStart w:id="17" w:name="_Toc223306053"/>
       <w:r>
         <w:t>Doctrine</w:t>
       </w:r>
-      <w:bookmarkEnd w:id="16"/>
+      <w:bookmarkEnd w:id="17"/>
     </w:p>
     <w:p>
       <w:pPr>
         <w:pStyle w:val="Heading1"/>
       </w:pPr>
-      <w:bookmarkStart w:id="17" w:name="_Toc223196278"/>
+      <w:bookmarkStart w:id="18" w:name="_Toc223306054"/>
       <w:r>
         <w:t>Practices</w:t>
       </w:r>
-      <w:bookmarkEnd w:id="17"/>
+      <w:bookmarkEnd w:id="18"/>
     </w:p>
     <w:p>
       <w:pPr>
         <w:pStyle w:val="Heading1"/>
       </w:pPr>
-      <w:bookmarkStart w:id="18" w:name="_Toc223196279"/>
+      <w:bookmarkStart w:id="19" w:name="_Toc223306055"/>
       <w:r>
         <w:t>The End Times</w:t>
       </w:r>
-      <w:bookmarkEnd w:id="18"/>
+      <w:bookmarkEnd w:id="19"/>
     </w:p>
     <w:p>
       <w:pPr>
@@ -2436,10 +2631,7 @@
     <w:sectPr>
       <w:headerReference w:type="even" r:id="rId8"/>
       <w:headerReference w:type="default" r:id="rId9"/>
-      <w:footerReference w:type="even" r:id="rId10"/>
-      <w:footerReference w:type="default" r:id="rId11"/>
-      <w:headerReference w:type="first" r:id="rId12"/>
-      <w:footerReference w:type="first" r:id="rId13"/>
+      <w:headerReference w:type="first" r:id="rId10"/>
       <w:pgSz w:w="11906" w:h="16838"/>
       <w:pgMar w:top="1440" w:right="1800" w:bottom="1440" w:left="1800" w:header="708" w:footer="708" w:gutter="0"/>
       <w:pgNumType w:start="0"/>
@@ -2468,36 +2660,6 @@
     </w:p>
   </w:endnote>
 </w:endnotes>
-</file>
-
-<file path=word/footer1.xml><?xml version="1.0" encoding="utf-8"?>
-<w:ftr xmlns:wpc="http://schemas.microsoft.com/office/word/2010/wordprocessingCanvas" xmlns:cx="http://schemas.microsoft.com/office/drawing/2014/chartex" xmlns:cx1="http://schemas.microsoft.com/office/drawing/2015/9/8/chartex" xmlns:cx2="http://schemas.microsoft.com/office/drawing/2015/10/21/chartex" xmlns:cx3="http://schemas.microsoft.com/office/drawing/2016/5/9/chartex" xmlns:cx4="http://schemas.microsoft.com/office/drawing/2016/5/10/chartex" xmlns:cx5="http://schemas.microsoft.com/office/drawing/2016/5/11/chartex" xmlns:cx6="http://schemas.microsoft.com/office/drawing/2016/5/12/chartex" xmlns:cx7="http://schemas.microsoft.com/office/drawing/2016/5/13/chartex" xmlns:cx8="http://schemas.microsoft.com/office/drawing/2016/5/14/chartex" xmlns:mc="http://schemas.openxmlformats.org/markup-compatibility/2006" xmlns:aink="http://schemas.microsoft.com/office/drawing/2016/ink" xmlns:am3d="http://schemas.microsoft.com/office/drawing/2017/model3d" xmlns:o="urn:schemas-microsoft-com:office:office" xmlns:oel="http://schemas.microsoft.com/office/2019/extlst" xmlns:r="http://schemas.openxmlformats.org/officeDocument/2006/relationships" xmlns:m="http://schemas.openxmlformats.org/officeDocument/2006/math" xmlns:v="urn:schemas-microsoft-com:vml" xmlns:wp14="http://schemas.microsoft.com/office/word/2010/wordprocessingDrawing" xmlns:wp="http://schemas.openxmlformats.org/drawingml/2006/wordprocessingDrawing" xmlns:w10="urn:schemas-microsoft-com:office:word" xmlns:w="http://schemas.openxmlformats.org/wordprocessingml/2006/main" xmlns:w14="http://schemas.microsoft.com/office/word/2010/wordml" xmlns:w15="http://schemas.microsoft.com/office/word/2012/wordml" xmlns:w16cex="http://schemas.microsoft.com/office/word/2018/wordml/cex" xmlns:w16cid="http://schemas.microsoft.com/office/word/2016/wordml/cid" xmlns:w16="http://schemas.microsoft.com/office/word/2018/wordml" xmlns:w16du="http://schemas.microsoft.com/office/word/2023/wordml/word16du" xmlns:w16sdtdh="http://schemas.microsoft.com/office/word/2020/wordml/sdtdatahash" xmlns:w16sdtfl="http://schemas.microsoft.com/office/word/2024/wordml/sdtformatlock" xmlns:w16se="http://schemas.microsoft.com/office/word/2015/wordml/symex" xmlns:wpg="http://schemas.microsoft.com/office/word/2010/wordprocessingGroup" xmlns:wpi="http://schemas.microsoft.com/office/word/2010/wordprocessingInk" xmlns:wne="http://schemas.microsoft.com/office/word/2006/wordml" xmlns:wps="http://schemas.microsoft.com/office/word/2010/wordprocessingShape" mc:Ignorable="w14 w15 w16se w16cid w16 w16cex w16sdtdh w16sdtfl w16du wp14">
-  <w:p>
-    <w:pPr>
-      <w:pStyle w:val="Footer"/>
-    </w:pPr>
-  </w:p>
-</w:ftr>
-</file>
-
-<file path=word/footer2.xml><?xml version="1.0" encoding="utf-8"?>
-<w:ftr xmlns:wpc="http://schemas.microsoft.com/office/word/2010/wordprocessingCanvas" xmlns:cx="http://schemas.microsoft.com/office/drawing/2014/chartex" xmlns:cx1="http://schemas.microsoft.com/office/drawing/2015/9/8/chartex" xmlns:cx2="http://schemas.microsoft.com/office/drawing/2015/10/21/chartex" xmlns:cx3="http://schemas.microsoft.com/office/drawing/2016/5/9/chartex" xmlns:cx4="http://schemas.microsoft.com/office/drawing/2016/5/10/chartex" xmlns:cx5="http://schemas.microsoft.com/office/drawing/2016/5/11/chartex" xmlns:cx6="http://schemas.microsoft.com/office/drawing/2016/5/12/chartex" xmlns:cx7="http://schemas.microsoft.com/office/drawing/2016/5/13/chartex" xmlns:cx8="http://schemas.microsoft.com/office/drawing/2016/5/14/chartex" xmlns:mc="http://schemas.openxmlformats.org/markup-compatibility/2006" xmlns:aink="http://schemas.microsoft.com/office/drawing/2016/ink" xmlns:am3d="http://schemas.microsoft.com/office/drawing/2017/model3d" xmlns:o="urn:schemas-microsoft-com:office:office" xmlns:oel="http://schemas.microsoft.com/office/2019/extlst" xmlns:r="http://schemas.openxmlformats.org/officeDocument/2006/relationships" xmlns:m="http://schemas.openxmlformats.org/officeDocument/2006/math" xmlns:v="urn:schemas-microsoft-com:vml" xmlns:wp14="http://schemas.microsoft.com/office/word/2010/wordprocessingDrawing" xmlns:wp="http://schemas.openxmlformats.org/drawingml/2006/wordprocessingDrawing" xmlns:w10="urn:schemas-microsoft-com:office:word" xmlns:w="http://schemas.openxmlformats.org/wordprocessingml/2006/main" xmlns:w14="http://schemas.microsoft.com/office/word/2010/wordml" xmlns:w15="http://schemas.microsoft.com/office/word/2012/wordml" xmlns:w16cex="http://schemas.microsoft.com/office/word/2018/wordml/cex" xmlns:w16cid="http://schemas.microsoft.com/office/word/2016/wordml/cid" xmlns:w16="http://schemas.microsoft.com/office/word/2018/wordml" xmlns:w16du="http://schemas.microsoft.com/office/word/2023/wordml/word16du" xmlns:w16sdtdh="http://schemas.microsoft.com/office/word/2020/wordml/sdtdatahash" xmlns:w16sdtfl="http://schemas.microsoft.com/office/word/2024/wordml/sdtformatlock" xmlns:w16se="http://schemas.microsoft.com/office/word/2015/wordml/symex" xmlns:wpg="http://schemas.microsoft.com/office/word/2010/wordprocessingGroup" xmlns:wpi="http://schemas.microsoft.com/office/word/2010/wordprocessingInk" xmlns:wne="http://schemas.microsoft.com/office/word/2006/wordml" xmlns:wps="http://schemas.microsoft.com/office/word/2010/wordprocessingShape" mc:Ignorable="w14 w15 w16se w16cid w16 w16cex w16sdtdh w16sdtfl w16du wp14">
-  <w:p>
-    <w:pPr>
-      <w:pStyle w:val="Footer"/>
-    </w:pPr>
-  </w:p>
-</w:ftr>
-</file>
-
-<file path=word/footer3.xml><?xml version="1.0" encoding="utf-8"?>
-<w:ftr xmlns:wpc="http://schemas.microsoft.com/office/word/2010/wordprocessingCanvas" xmlns:cx="http://schemas.microsoft.com/office/drawing/2014/chartex" xmlns:cx1="http://schemas.microsoft.com/office/drawing/2015/9/8/chartex" xmlns:cx2="http://schemas.microsoft.com/office/drawing/2015/10/21/chartex" xmlns:cx3="http://schemas.microsoft.com/office/drawing/2016/5/9/chartex" xmlns:cx4="http://schemas.microsoft.com/office/drawing/2016/5/10/chartex" xmlns:cx5="http://schemas.microsoft.com/office/drawing/2016/5/11/chartex" xmlns:cx6="http://schemas.microsoft.com/office/drawing/2016/5/12/chartex" xmlns:cx7="http://schemas.microsoft.com/office/drawing/2016/5/13/chartex" xmlns:cx8="http://schemas.microsoft.com/office/drawing/2016/5/14/chartex" xmlns:mc="http://schemas.openxmlformats.org/markup-compatibility/2006" xmlns:aink="http://schemas.microsoft.com/office/drawing/2016/ink" xmlns:am3d="http://schemas.microsoft.com/office/drawing/2017/model3d" xmlns:o="urn:schemas-microsoft-com:office:office" xmlns:oel="http://schemas.microsoft.com/office/2019/extlst" xmlns:r="http://schemas.openxmlformats.org/officeDocument/2006/relationships" xmlns:m="http://schemas.openxmlformats.org/officeDocument/2006/math" xmlns:v="urn:schemas-microsoft-com:vml" xmlns:wp14="http://schemas.microsoft.com/office/word/2010/wordprocessingDrawing" xmlns:wp="http://schemas.openxmlformats.org/drawingml/2006/wordprocessingDrawing" xmlns:w10="urn:schemas-microsoft-com:office:word" xmlns:w="http://schemas.openxmlformats.org/wordprocessingml/2006/main" xmlns:w14="http://schemas.microsoft.com/office/word/2010/wordml" xmlns:w15="http://schemas.microsoft.com/office/word/2012/wordml" xmlns:w16cex="http://schemas.microsoft.com/office/word/2018/wordml/cex" xmlns:w16cid="http://schemas.microsoft.com/office/word/2016/wordml/cid" xmlns:w16="http://schemas.microsoft.com/office/word/2018/wordml" xmlns:w16du="http://schemas.microsoft.com/office/word/2023/wordml/word16du" xmlns:w16sdtdh="http://schemas.microsoft.com/office/word/2020/wordml/sdtdatahash" xmlns:w16sdtfl="http://schemas.microsoft.com/office/word/2024/wordml/sdtformatlock" xmlns:w16se="http://schemas.microsoft.com/office/word/2015/wordml/symex" xmlns:wpg="http://schemas.microsoft.com/office/word/2010/wordprocessingGroup" xmlns:wpi="http://schemas.microsoft.com/office/word/2010/wordprocessingInk" xmlns:wne="http://schemas.microsoft.com/office/word/2006/wordml" xmlns:wps="http://schemas.microsoft.com/office/word/2010/wordprocessingShape" mc:Ignorable="w14 w15 w16se w16cid w16 w16cex w16sdtdh w16sdtfl w16du wp14">
-  <w:p>
-    <w:pPr>
-      <w:pStyle w:val="Footer"/>
-    </w:pPr>
-  </w:p>
-</w:ftr>
 </file>
 
 <file path=word/footnotes.xml><?xml version="1.0" encoding="utf-8"?>
@@ -2551,6 +2713,7 @@
         </v:shapetype>
         <v:shape id="WordPictureWatermark34453266" o:spid="_x0000_s1058" type="#_x0000_t75" style="position:absolute;margin-left:0;margin-top:0;width:596.15pt;height:842.2pt;z-index:-251657216;mso-position-horizontal:center;mso-position-horizontal-relative:margin;mso-position-vertical:center;mso-position-vertical-relative:margin" o:allowincell="f">
           <v:imagedata r:id="rId1" o:title="Artboard 1"/>
+          <w10:wrap anchorx="margin" anchory="margin"/>
         </v:shape>
       </w:pict>
     </w:r>
@@ -2590,6 +2753,7 @@
         </v:shapetype>
         <v:shape id="WordPictureWatermark34453267" o:spid="_x0000_s1059" type="#_x0000_t75" style="position:absolute;margin-left:0;margin-top:0;width:596.15pt;height:842.2pt;z-index:-251656192;mso-position-horizontal:center;mso-position-horizontal-relative:margin;mso-position-vertical:center;mso-position-vertical-relative:margin" o:allowincell="f">
           <v:imagedata r:id="rId1" o:title="Artboard 1" gain="1.25"/>
+          <w10:wrap anchorx="margin" anchory="margin"/>
         </v:shape>
       </w:pict>
     </w:r>
@@ -2629,6 +2793,7 @@
         </v:shapetype>
         <v:shape id="WordPictureWatermark34453265" o:spid="_x0000_s1057" type="#_x0000_t75" style="position:absolute;margin-left:0;margin-top:0;width:596.15pt;height:842.2pt;z-index:-251658240;mso-position-horizontal:center;mso-position-horizontal-relative:margin;mso-position-vertical:center;mso-position-vertical-relative:margin" o:allowincell="f">
           <v:imagedata r:id="rId1" o:title="Artboard 1"/>
+          <w10:wrap anchorx="margin" anchory="margin"/>
         </v:shape>
       </w:pict>
     </w:r>
@@ -3249,6 +3414,7 @@
   <w:style w:type="character" w:default="1" w:styleId="DefaultParagraphFont">
     <w:name w:val="Default Paragraph Font"/>
     <w:uiPriority w:val="1"/>
+    <w:semiHidden/>
     <w:unhideWhenUsed/>
   </w:style>
   <w:style w:type="table" w:default="1" w:styleId="TableNormal">

</xml_diff>